<commit_message>
format: aumentar ancho de logos en liquidacion
</commit_message>
<xml_diff>
--- a/liquidacion/analytica/Report/PrintPropuestaValorizacion.docx
+++ b/liquidacion/analytica/Report/PrintPropuestaValorizacion.docx
@@ -29,6 +29,179 @@
             <w:pPr>
               <w:pStyle w:val="Informacindecontacto"/>
             </w:pPr>
+            <w:r>
+              <w:rPr>
+                <w:rFonts w:ascii="Times New Roman" w:hAnsi="Times New Roman" w:cs="Times New Roman"/>
+                <w:szCs w:val="24"/>
+                <w:lang w:val="es-PE" w:eastAsia="es-PE"/>
+              </w:rPr>
+              <mc:AlternateContent>
+                <mc:Choice Requires="wps">
+                  <w:drawing>
+                    <wp:anchor distT="0" distB="0" distL="114300" distR="114300" simplePos="0" relativeHeight="251662336" behindDoc="0" locked="0" layoutInCell="1" allowOverlap="1" wp14:anchorId="522B1D2F" wp14:editId="0A75E3BD">
+                      <wp:simplePos x="0" y="0"/>
+                      <wp:positionH relativeFrom="margin">
+                        <wp:posOffset>4415155</wp:posOffset>
+                      </wp:positionH>
+                      <wp:positionV relativeFrom="paragraph">
+                        <wp:posOffset>11430</wp:posOffset>
+                      </wp:positionV>
+                      <wp:extent cx="2386965" cy="927735"/>
+                      <wp:effectExtent l="0" t="0" r="0" b="0"/>
+                      <wp:wrapNone/>
+                      <wp:docPr id="1154350600" name="Rectángulo: esquinas redondeadas 1154350600"/>
+                      <wp:cNvGraphicFramePr>
+                        <a:graphicFrameLocks xmlns:a="http://schemas.openxmlformats.org/drawingml/2006/main"/>
+                      </wp:cNvGraphicFramePr>
+                      <a:graphic xmlns:a="http://schemas.openxmlformats.org/drawingml/2006/main">
+                        <a:graphicData uri="http://schemas.microsoft.com/office/word/2010/wordprocessingShape">
+                          <wps:wsp>
+                            <wps:cNvSpPr>
+                              <a:spLocks noChangeArrowheads="1"/>
+                            </wps:cNvSpPr>
+                            <wps:spPr bwMode="auto">
+                              <a:xfrm>
+                                <a:off x="0" y="0"/>
+                                <a:ext cx="2386965" cy="927735"/>
+                              </a:xfrm>
+                              <a:prstGeom prst="roundRect">
+                                <a:avLst>
+                                  <a:gd name="adj" fmla="val 16667"/>
+                                </a:avLst>
+                              </a:prstGeom>
+                              <a:noFill/>
+                              <a:ln w="9525">
+                                <a:noFill/>
+                                <a:miter lim="800000"/>
+                                <a:headEnd/>
+                                <a:tailEnd/>
+                              </a:ln>
+                            </wps:spPr>
+                            <wps:txbx>
+                              <w:txbxContent>
+                                <w:p>
+                                  <w:pPr>
+                                    <w:jc w:val="center"/>
+                                  </w:pPr>
+                                  <w:r>
+                                    <w:rPr>
+                                      <w:rFonts w:ascii="Arial" w:eastAsia="Arial Unicode MS" w:hAnsi="Arial"/>
+                                      <w:sz w:val="18"/>
+                                      <w:szCs w:val="18"/>
+                                    </w:rPr>
+                                    <w:fldChar w:fldCharType="begin"/>
+                                  </w:r>
+                                  <w:r>
+                                    <w:rPr>
+                                      <w:rFonts w:ascii="Arial" w:eastAsia="Arial Unicode MS" w:hAnsi="Arial"/>
+                                      <w:sz w:val="18"/>
+                                      <w:szCs w:val="18"/>
+                                    </w:rPr>
+                                    <w:instrText xml:space="preserve"> MERGEFIELD  Image:logoEmpresa  \* MERGEFORMAT </w:instrText>
+                                  </w:r>
+                                  <w:r>
+                                    <w:rPr>
+                                      <w:rFonts w:ascii="Arial" w:eastAsia="Arial Unicode MS" w:hAnsi="Arial"/>
+                                      <w:sz w:val="18"/>
+                                      <w:szCs w:val="18"/>
+                                    </w:rPr>
+                                    <w:fldChar w:fldCharType="separate"/>
+                                  </w:r>
+                                  <w:r>
+                                    <w:rPr>
+                                      <w:rFonts w:ascii="Arial" w:eastAsia="Arial Unicode MS" w:hAnsi="Arial"/>
+                                      <w:noProof/>
+                                      <w:sz w:val="18"/>
+                                      <w:szCs w:val="18"/>
+                                    </w:rPr>
+                                    <w:t>«Image:logoEmpresa»</w:t>
+                                  </w:r>
+                                  <w:r>
+                                    <w:rPr>
+                                      <w:rFonts w:ascii="Arial" w:eastAsia="Arial Unicode MS" w:hAnsi="Arial"/>
+                                      <w:sz w:val="18"/>
+                                      <w:szCs w:val="18"/>
+                                    </w:rPr>
+                                    <w:fldChar w:fldCharType="end"/>
+                                  </w:r>
+                                </w:p>
+                              </w:txbxContent>
+                            </wps:txbx>
+                            <wps:bodyPr rot="0" vertOverflow="clip" horzOverflow="clip" vert="horz" wrap="square" lIns="91440" tIns="45720" rIns="91440" bIns="45720" anchor="t" anchorCtr="0" upright="1">
+                              <a:noAutofit/>
+                            </wps:bodyPr>
+                          </wps:wsp>
+                        </a:graphicData>
+                      </a:graphic>
+                      <wp14:sizeRelH relativeFrom="margin">
+                        <wp14:pctWidth>0</wp14:pctWidth>
+                      </wp14:sizeRelH>
+                      <wp14:sizeRelV relativeFrom="margin">
+                        <wp14:pctHeight>0</wp14:pctHeight>
+                      </wp14:sizeRelV>
+                    </wp:anchor>
+                  </w:drawing>
+                </mc:Choice>
+                <mc:Fallback>
+                  <w:pict>
+                    <v:roundrect w14:anchorId="522B1D2F" id="Rectángulo: esquinas redondeadas 1154350600" o:spid="_x0000_s1026" style="position:absolute;margin-left:347.65pt;margin-top:.9pt;width:187.95pt;height:73.05pt;z-index:251662336;visibility:visible;mso-wrap-style:square;mso-width-percent:0;mso-height-percent:0;mso-wrap-distance-left:9pt;mso-wrap-distance-top:0;mso-wrap-distance-right:9pt;mso-wrap-distance-bottom:0;mso-position-horizontal:absolute;mso-position-horizontal-relative:margin;mso-position-vertical:absolute;mso-position-vertical-relative:text;mso-width-percent:0;mso-height-percent:0;mso-width-relative:margin;mso-height-relative:margin;v-text-anchor:top" arcsize="10923f" o:gfxdata="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" filled="f" stroked="f">
+                      <v:stroke joinstyle="miter"/>
+                      <v:textbox>
+                        <w:txbxContent>
+                          <w:p>
+                            <w:pPr>
+                              <w:jc w:val="center"/>
+                            </w:pPr>
+                            <w:r>
+                              <w:rPr>
+                                <w:rFonts w:ascii="Arial" w:eastAsia="Arial Unicode MS" w:hAnsi="Arial"/>
+                                <w:sz w:val="18"/>
+                                <w:szCs w:val="18"/>
+                              </w:rPr>
+                              <w:fldChar w:fldCharType="begin"/>
+                            </w:r>
+                            <w:r>
+                              <w:rPr>
+                                <w:rFonts w:ascii="Arial" w:eastAsia="Arial Unicode MS" w:hAnsi="Arial"/>
+                                <w:sz w:val="18"/>
+                                <w:szCs w:val="18"/>
+                              </w:rPr>
+                              <w:instrText xml:space="preserve"> MERGEFIELD  Image:logoEmpresa  \* MERGEFORMAT </w:instrText>
+                            </w:r>
+                            <w:r>
+                              <w:rPr>
+                                <w:rFonts w:ascii="Arial" w:eastAsia="Arial Unicode MS" w:hAnsi="Arial"/>
+                                <w:sz w:val="18"/>
+                                <w:szCs w:val="18"/>
+                              </w:rPr>
+                              <w:fldChar w:fldCharType="separate"/>
+                            </w:r>
+                            <w:r>
+                              <w:rPr>
+                                <w:rFonts w:ascii="Arial" w:eastAsia="Arial Unicode MS" w:hAnsi="Arial"/>
+                                <w:noProof/>
+                                <w:sz w:val="18"/>
+                                <w:szCs w:val="18"/>
+                              </w:rPr>
+                              <w:t>«Image:logoEmpresa»</w:t>
+                            </w:r>
+                            <w:r>
+                              <w:rPr>
+                                <w:rFonts w:ascii="Arial" w:eastAsia="Arial Unicode MS" w:hAnsi="Arial"/>
+                                <w:sz w:val="18"/>
+                                <w:szCs w:val="18"/>
+                              </w:rPr>
+                              <w:fldChar w:fldCharType="end"/>
+                            </w:r>
+                          </w:p>
+                        </w:txbxContent>
+                      </v:textbox>
+                      <w10:wrap anchorx="margin"/>
+                    </v:roundrect>
+                  </w:pict>
+                </mc:Fallback>
+              </mc:AlternateContent>
+            </w:r>
           </w:p>
           <w:p>
             <w:pPr>
@@ -216,180 +389,6 @@
                 <w:color w:val="006666" w:themeColor="accent3"/>
               </w:rPr>
             </w:pPr>
-            <w:r>
-              <w:rPr>
-                <w:rFonts w:ascii="Times New Roman" w:hAnsi="Times New Roman" w:cs="Times New Roman"/>
-                <w:sz w:val="24"/>
-                <w:szCs w:val="24"/>
-                <w:lang w:val="es-PE" w:eastAsia="es-PE"/>
-              </w:rPr>
-              <mc:AlternateContent>
-                <mc:Choice Requires="wps">
-                  <w:drawing>
-                    <wp:anchor distT="0" distB="0" distL="114300" distR="114300" simplePos="0" relativeHeight="251662336" behindDoc="0" locked="0" layoutInCell="1" allowOverlap="1" wp14:anchorId="522B1D2F" wp14:editId="0DC51D90">
-                      <wp:simplePos x="0" y="0"/>
-                      <wp:positionH relativeFrom="margin">
-                        <wp:posOffset>168910</wp:posOffset>
-                      </wp:positionH>
-                      <wp:positionV relativeFrom="paragraph">
-                        <wp:posOffset>-23495</wp:posOffset>
-                      </wp:positionV>
-                      <wp:extent cx="2386965" cy="927735"/>
-                      <wp:effectExtent l="0" t="0" r="0" b="0"/>
-                      <wp:wrapNone/>
-                      <wp:docPr id="1154350600" name="Rectángulo: esquinas redondeadas 1154350600"/>
-                      <wp:cNvGraphicFramePr>
-                        <a:graphicFrameLocks xmlns:a="http://schemas.openxmlformats.org/drawingml/2006/main"/>
-                      </wp:cNvGraphicFramePr>
-                      <a:graphic xmlns:a="http://schemas.openxmlformats.org/drawingml/2006/main">
-                        <a:graphicData uri="http://schemas.microsoft.com/office/word/2010/wordprocessingShape">
-                          <wps:wsp>
-                            <wps:cNvSpPr>
-                              <a:spLocks noChangeArrowheads="1"/>
-                            </wps:cNvSpPr>
-                            <wps:spPr bwMode="auto">
-                              <a:xfrm>
-                                <a:off x="0" y="0"/>
-                                <a:ext cx="2386965" cy="927735"/>
-                              </a:xfrm>
-                              <a:prstGeom prst="roundRect">
-                                <a:avLst>
-                                  <a:gd name="adj" fmla="val 16667"/>
-                                </a:avLst>
-                              </a:prstGeom>
-                              <a:noFill/>
-                              <a:ln w="9525">
-                                <a:noFill/>
-                                <a:miter lim="800000"/>
-                                <a:headEnd/>
-                                <a:tailEnd/>
-                              </a:ln>
-                            </wps:spPr>
-                            <wps:txbx>
-                              <w:txbxContent>
-                                <w:p>
-                                  <w:pPr>
-                                    <w:jc w:val="center"/>
-                                  </w:pPr>
-                                  <w:r>
-                                    <w:rPr>
-                                      <w:rFonts w:ascii="Arial" w:eastAsia="Arial Unicode MS" w:hAnsi="Arial"/>
-                                      <w:sz w:val="18"/>
-                                      <w:szCs w:val="18"/>
-                                    </w:rPr>
-                                    <w:fldChar w:fldCharType="begin"/>
-                                  </w:r>
-                                  <w:r>
-                                    <w:rPr>
-                                      <w:rFonts w:ascii="Arial" w:eastAsia="Arial Unicode MS" w:hAnsi="Arial"/>
-                                      <w:sz w:val="18"/>
-                                      <w:szCs w:val="18"/>
-                                    </w:rPr>
-                                    <w:instrText xml:space="preserve"> MERGEFIELD  Image:logoEmpresa  \* MERGEFORMAT </w:instrText>
-                                  </w:r>
-                                  <w:r>
-                                    <w:rPr>
-                                      <w:rFonts w:ascii="Arial" w:eastAsia="Arial Unicode MS" w:hAnsi="Arial"/>
-                                      <w:sz w:val="18"/>
-                                      <w:szCs w:val="18"/>
-                                    </w:rPr>
-                                    <w:fldChar w:fldCharType="separate"/>
-                                  </w:r>
-                                  <w:r>
-                                    <w:rPr>
-                                      <w:rFonts w:ascii="Arial" w:eastAsia="Arial Unicode MS" w:hAnsi="Arial"/>
-                                      <w:noProof/>
-                                      <w:sz w:val="18"/>
-                                      <w:szCs w:val="18"/>
-                                    </w:rPr>
-                                    <w:t>«Image:logoEmpresa»</w:t>
-                                  </w:r>
-                                  <w:r>
-                                    <w:rPr>
-                                      <w:rFonts w:ascii="Arial" w:eastAsia="Arial Unicode MS" w:hAnsi="Arial"/>
-                                      <w:sz w:val="18"/>
-                                      <w:szCs w:val="18"/>
-                                    </w:rPr>
-                                    <w:fldChar w:fldCharType="end"/>
-                                  </w:r>
-                                </w:p>
-                              </w:txbxContent>
-                            </wps:txbx>
-                            <wps:bodyPr rot="0" vertOverflow="clip" horzOverflow="clip" vert="horz" wrap="square" lIns="91440" tIns="45720" rIns="91440" bIns="45720" anchor="t" anchorCtr="0" upright="1">
-                              <a:noAutofit/>
-                            </wps:bodyPr>
-                          </wps:wsp>
-                        </a:graphicData>
-                      </a:graphic>
-                      <wp14:sizeRelH relativeFrom="margin">
-                        <wp14:pctWidth>0</wp14:pctWidth>
-                      </wp14:sizeRelH>
-                      <wp14:sizeRelV relativeFrom="margin">
-                        <wp14:pctHeight>0</wp14:pctHeight>
-                      </wp14:sizeRelV>
-                    </wp:anchor>
-                  </w:drawing>
-                </mc:Choice>
-                <mc:Fallback>
-                  <w:pict>
-                    <v:roundrect w14:anchorId="522B1D2F" id="Rectángulo: esquinas redondeadas 1154350600" o:spid="_x0000_s1026" style="position:absolute;left:0;text-align:left;margin-left:13.3pt;margin-top:-1.85pt;width:187.95pt;height:73.05pt;z-index:251662336;visibility:visible;mso-wrap-style:square;mso-width-percent:0;mso-height-percent:0;mso-wrap-distance-left:9pt;mso-wrap-distance-top:0;mso-wrap-distance-right:9pt;mso-wrap-distance-bottom:0;mso-position-horizontal:absolute;mso-position-horizontal-relative:margin;mso-position-vertical:absolute;mso-position-vertical-relative:text;mso-width-percent:0;mso-height-percent:0;mso-width-relative:margin;mso-height-relative:margin;v-text-anchor:top" arcsize="10923f" o:gfxdata="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" filled="f" stroked="f">
-                      <v:stroke joinstyle="miter"/>
-                      <v:textbox>
-                        <w:txbxContent>
-                          <w:p>
-                            <w:pPr>
-                              <w:jc w:val="center"/>
-                            </w:pPr>
-                            <w:r>
-                              <w:rPr>
-                                <w:rFonts w:ascii="Arial" w:eastAsia="Arial Unicode MS" w:hAnsi="Arial"/>
-                                <w:sz w:val="18"/>
-                                <w:szCs w:val="18"/>
-                              </w:rPr>
-                              <w:fldChar w:fldCharType="begin"/>
-                            </w:r>
-                            <w:r>
-                              <w:rPr>
-                                <w:rFonts w:ascii="Arial" w:eastAsia="Arial Unicode MS" w:hAnsi="Arial"/>
-                                <w:sz w:val="18"/>
-                                <w:szCs w:val="18"/>
-                              </w:rPr>
-                              <w:instrText xml:space="preserve"> MERGEFIELD  Image:logoEmpresa  \* MERGEFORMAT </w:instrText>
-                            </w:r>
-                            <w:r>
-                              <w:rPr>
-                                <w:rFonts w:ascii="Arial" w:eastAsia="Arial Unicode MS" w:hAnsi="Arial"/>
-                                <w:sz w:val="18"/>
-                                <w:szCs w:val="18"/>
-                              </w:rPr>
-                              <w:fldChar w:fldCharType="separate"/>
-                            </w:r>
-                            <w:r>
-                              <w:rPr>
-                                <w:rFonts w:ascii="Arial" w:eastAsia="Arial Unicode MS" w:hAnsi="Arial"/>
-                                <w:noProof/>
-                                <w:sz w:val="18"/>
-                                <w:szCs w:val="18"/>
-                              </w:rPr>
-                              <w:t>«Image:logoEmpresa»</w:t>
-                            </w:r>
-                            <w:r>
-                              <w:rPr>
-                                <w:rFonts w:ascii="Arial" w:eastAsia="Arial Unicode MS" w:hAnsi="Arial"/>
-                                <w:sz w:val="18"/>
-                                <w:szCs w:val="18"/>
-                              </w:rPr>
-                              <w:fldChar w:fldCharType="end"/>
-                            </w:r>
-                          </w:p>
-                        </w:txbxContent>
-                      </v:textbox>
-                      <w10:wrap anchorx="margin"/>
-                    </v:roundrect>
-                  </w:pict>
-                </mc:Fallback>
-              </mc:AlternateContent>
-            </w:r>
           </w:p>
         </w:tc>
       </w:tr>
@@ -4991,6 +4990,7 @@
     <w:sig w:usb0="00000287" w:usb1="00000000" w:usb2="00000000" w:usb3="00000000" w:csb0="0000009F" w:csb1="00000000"/>
   </w:font>
   <w:font w:name="MS Mincho">
+    <w:altName w:val="ＭＳ 明朝"/>
     <w:panose1 w:val="02020609040205080304"/>
     <w:charset w:val="80"/>
     <w:family w:val="modern"/>
@@ -5128,6 +5128,7 @@
     <w:rsid w:val="00920ECC"/>
     <w:rsid w:val="00933C29"/>
     <w:rsid w:val="009438F4"/>
+    <w:rsid w:val="009865F9"/>
     <w:rsid w:val="009A2035"/>
     <w:rsid w:val="009B23AF"/>
     <w:rsid w:val="00A16F62"/>
@@ -5149,6 +5150,7 @@
     <w:rsid w:val="00EE24CB"/>
     <w:rsid w:val="00F03829"/>
     <w:rsid w:val="00F42731"/>
+    <w:rsid w:val="00F90672"/>
   </w:rsids>
   <m:mathPr>
     <m:mathFont m:val="Cambria Math"/>
@@ -5907,12 +5909,11 @@
 </file>
 
 <file path=customXml/item1.xml><?xml version="1.0" encoding="utf-8"?>
-<?mso-contentType ?>
-<FormTemplates xmlns="http://schemas.microsoft.com/sharepoint/v3/contenttype/forms">
-  <Display>DocumentLibraryForm</Display>
-  <Edit>DocumentLibraryForm</Edit>
-  <New>DocumentLibraryForm</New>
-</FormTemplates>
+<p:properties xmlns:p="http://schemas.microsoft.com/office/2006/metadata/properties" xmlns:xsi="http://www.w3.org/2001/XMLSchema-instance" xmlns:pc="http://schemas.microsoft.com/office/infopath/2007/PartnerControls">
+  <documentManagement>
+    <MediaServiceKeyPoints xmlns="71af3243-3dd4-4a8d-8c0d-dd76da1f02a5" xsi:nil="true"/>
+  </documentManagement>
+</p:properties>
 </file>
 
 <file path=customXml/item2.xml><?xml version="1.0" encoding="utf-8"?>
@@ -6127,17 +6128,20 @@
 </file>
 
 <file path=customXml/item3.xml><?xml version="1.0" encoding="utf-8"?>
-<p:properties xmlns:p="http://schemas.microsoft.com/office/2006/metadata/properties" xmlns:xsi="http://www.w3.org/2001/XMLSchema-instance" xmlns:pc="http://schemas.microsoft.com/office/infopath/2007/PartnerControls">
-  <documentManagement>
-    <MediaServiceKeyPoints xmlns="71af3243-3dd4-4a8d-8c0d-dd76da1f02a5" xsi:nil="true"/>
-  </documentManagement>
-</p:properties>
+<?mso-contentType ?>
+<FormTemplates xmlns="http://schemas.microsoft.com/sharepoint/v3/contenttype/forms">
+  <Display>DocumentLibraryForm</Display>
+  <Edit>DocumentLibraryForm</Edit>
+  <New>DocumentLibraryForm</New>
+</FormTemplates>
 </file>
 
 <file path=customXml/itemProps1.xml><?xml version="1.0" encoding="utf-8"?>
-<ds:datastoreItem xmlns:ds="http://schemas.openxmlformats.org/officeDocument/2006/customXml" ds:itemID="{BEA6D05B-AD60-405F-B8DB-FC61ABCDF8E2}">
+<ds:datastoreItem xmlns:ds="http://schemas.openxmlformats.org/officeDocument/2006/customXml" ds:itemID="{B550BB7C-2FBC-4612-9ECE-2EA076035D14}">
   <ds:schemaRefs>
-    <ds:schemaRef ds:uri="http://schemas.microsoft.com/sharepoint/v3/contenttype/forms"/>
+    <ds:schemaRef ds:uri="http://schemas.microsoft.com/office/2006/metadata/properties"/>
+    <ds:schemaRef ds:uri="http://schemas.microsoft.com/office/infopath/2007/PartnerControls"/>
+    <ds:schemaRef ds:uri="71af3243-3dd4-4a8d-8c0d-dd76da1f02a5"/>
   </ds:schemaRefs>
 </ds:datastoreItem>
 </file>
@@ -6162,11 +6166,9 @@
 </file>
 
 <file path=customXml/itemProps3.xml><?xml version="1.0" encoding="utf-8"?>
-<ds:datastoreItem xmlns:ds="http://schemas.openxmlformats.org/officeDocument/2006/customXml" ds:itemID="{B550BB7C-2FBC-4612-9ECE-2EA076035D14}">
+<ds:datastoreItem xmlns:ds="http://schemas.openxmlformats.org/officeDocument/2006/customXml" ds:itemID="{BEA6D05B-AD60-405F-B8DB-FC61ABCDF8E2}">
   <ds:schemaRefs>
-    <ds:schemaRef ds:uri="http://schemas.microsoft.com/office/2006/metadata/properties"/>
-    <ds:schemaRef ds:uri="http://schemas.microsoft.com/office/infopath/2007/PartnerControls"/>
-    <ds:schemaRef ds:uri="71af3243-3dd4-4a8d-8c0d-dd76da1f02a5"/>
+    <ds:schemaRef ds:uri="http://schemas.microsoft.com/sharepoint/v3/contenttype/forms"/>
   </ds:schemaRefs>
 </ds:datastoreItem>
 </file>
</xml_diff>